<commit_message>
Harden public input checks and apply reviewed presentation fixes
</commit_message>
<xml_diff>
--- a/portfolio/PROJECT_BRIEF.docx
+++ b/portfolio/PROJECT_BRIEF.docx
@@ -9,8 +9,19 @@
       <w:r>
         <w:rPr>
           <w:b w:val="0"/>
+          <w:i w:val="0"/>
         </w:rPr>
         <w:t>DDR TargetBridge</w:t>
+      </w:r>
+    </w:p>
+    <w:p>
+      <w:pPr/>
+      <w:r>
+        <w:rPr>
+          <w:b/>
+          <w:i w:val="0"/>
+        </w:rPr>
+        <w:t>Comparator membership in a DNA-PK inhibitor screen</w:t>
       </w:r>
     </w:p>
     <w:p>
@@ -20,225 +31,236 @@
       <w:r>
         <w:rPr>
           <w:b w:val="0"/>
+          <w:i w:val="0"/>
         </w:rPr>
-        <w:t>When a pathway comparison changes because its members change</w:t>
+        <w:t>Research question</w:t>
       </w:r>
     </w:p>
     <w:p>
-      <w:r>
-        <w:rPr>
-          <w:b/>
-        </w:rPr>
-        <w:t>Completed computational functional-genomics case study · Public-data secondary analysis</w:t>
-      </w:r>
-    </w:p>
-    <w:p>
-      <w:r>
-        <w:rPr>
-          <w:b/>
-        </w:rPr>
-        <w:t>Question.</w:t>
-      </w:r>
+      <w:pPr/>
       <w:r>
         <w:rPr>
           <w:b w:val="0"/>
+          <w:i w:val="0"/>
         </w:rPr>
-        <w:t xml:space="preserve"> Does a proposed pathway priority survive changes in the genes and targeting units actually represented in a CRISPR screen?</w:t>
-      </w:r>
-    </w:p>
-    <w:p>
-      <w:r>
-        <w:rPr>
-          <w:b/>
-        </w:rPr>
-        <w:t>Approach.</w:t>
-      </w:r>
-      <w:r>
-        <w:rPr>
-          <w:b w:val="0"/>
-        </w:rPr>
-        <w:t xml:space="preserve"> Reanalyse one A549 WT/PRDX1-KO × vehicle/AZD7648 experiment. Keep pathway definitions, three support views and two count transforms fixed; separate the mitochondrial-translation arm from the Eukaryotic Translation Elongation comparator; preserve every sample and the low-count limitations.</w:t>
+        <w:t>Can a pathway-prioritization argument retain its direction when the genes and annotation-defined targeting units included in the comparison change?</w:t>
       </w:r>
     </w:p>
     <w:p>
       <w:pPr>
-        <w:spacing w:after="60"/>
-        <w:jc w:val="center"/>
+        <w:pStyle w:val="Heading1"/>
       </w:pPr>
       <w:r>
-        <w:drawing>
-          <wp:inline xmlns:a="http://schemas.openxmlformats.org/drawingml/2006/main" xmlns:pic="http://schemas.openxmlformats.org/drawingml/2006/picture">
-            <wp:extent cx="4846320" cy="2942304"/>
-            <wp:docPr id="1" name="Picture 1" descr="The comparator changes, not the mitochondrial component"/>
-            <wp:cNvGraphicFramePr>
-              <a:graphicFrameLocks noChangeAspect="1"/>
-            </wp:cNvGraphicFramePr>
-            <a:graphic>
-              <a:graphicData uri="http://schemas.openxmlformats.org/drawingml/2006/picture">
-                <pic:pic>
-                  <pic:nvPicPr>
-                    <pic:cNvPr id="0" name="01_components.png"/>
-                    <pic:cNvPicPr/>
-                  </pic:nvPicPr>
-                  <pic:blipFill>
-                    <a:blip r:embed="rId11"/>
-                    <a:stretch>
-                      <a:fillRect/>
-                    </a:stretch>
-                  </pic:blipFill>
-                  <pic:spPr>
-                    <a:xfrm>
-                      <a:off x="0" y="0"/>
-                      <a:ext cx="4846320" cy="2942304"/>
-                    </a:xfrm>
-                    <a:prstGeom prst="rect"/>
-                  </pic:spPr>
-                </pic:pic>
-              </a:graphicData>
-            </a:graphic>
-          </wp:inline>
-        </w:drawing>
+        <w:rPr>
+          <w:b w:val="0"/>
+          <w:i w:val="0"/>
+        </w:rPr>
+        <w:t>Approach</w:t>
       </w:r>
     </w:p>
     <w:p>
-      <w:r>
-        <w:rPr>
-          <w:b/>
-        </w:rPr>
-        <w:t>Key result.</w:t>
-      </w:r>
+      <w:pPr/>
       <w:r>
         <w:rPr>
           <w:b w:val="0"/>
+          <w:i w:val="0"/>
         </w:rPr>
-        <w:t xml:space="preserve"> The conditional balance changes from </w:t>
+        <w:t>This public-data case study examines an A549 WT/PRDX1-KO × vehicle/AZD7648 screen. It compares fixed mitochondrial-translation (M) and translation-elongation (E) sets under three support views and two transformations, separating targeting-unit changes from additional genes.</w:t>
+      </w:r>
+    </w:p>
+    <w:p>
+      <w:pPr>
+        <w:pStyle w:val="Heading1"/>
+      </w:pPr>
+      <w:r>
+        <w:rPr>
+          <w:b w:val="0"/>
+          <w:i w:val="0"/>
+        </w:rPr>
+        <w:t>Main result</w:t>
+      </w:r>
+    </w:p>
+    <w:p>
+      <w:pPr/>
+      <w:r>
+        <w:rPr>
+          <w:b w:val="0"/>
+          <w:i w:val="0"/>
+        </w:rPr>
+        <w:t xml:space="preserve">M was nearly stable. E changed as its supported population expanded from 23 to 91 genes; the M−E contrast changed from </w:t>
       </w:r>
       <w:r>
         <w:rPr>
           <w:b/>
+          <w:i w:val="0"/>
         </w:rPr>
         <w:t>+0.861 to −1.761</w:t>
       </w:r>
       <w:r>
         <w:rPr>
           <w:b w:val="0"/>
+          <w:i w:val="0"/>
         </w:rPr>
-        <w:t xml:space="preserve">. The mitochondrial arm remains near </w:t>
+        <w:t xml:space="preserve"> under zero-only replacement. Count+1 gave the same sign reversal. The added E population also included many low-count observations.</w:t>
+      </w:r>
+    </w:p>
+    <w:p>
+      <w:pPr>
+        <w:pStyle w:val="Heading1"/>
+      </w:pPr>
+      <w:r>
+        <w:rPr>
+          <w:b w:val="0"/>
+          <w:i w:val="0"/>
+        </w:rPr>
+        <w:t>Interpretation</w:t>
+      </w:r>
+    </w:p>
+    <w:p>
+      <w:pPr/>
+      <w:r>
+        <w:rPr>
+          <w:b w:val="0"/>
+          <w:i w:val="0"/>
+        </w:rPr>
+        <w:t>The initial positive contrast is not a membership-insensitive basis for a mitochondrial-specific priority. Expanded coverage is not a corrected biological truth. The result is a local empirical diagnosis, not target validation or a new mechanism.</w:t>
+      </w:r>
+    </w:p>
+    <w:p>
+      <w:pPr>
+        <w:pStyle w:val="Heading1"/>
+      </w:pPr>
+      <w:r>
+        <w:rPr>
+          <w:b w:val="0"/>
+          <w:i w:val="0"/>
+        </w:rPr>
+        <w:t>Contribution and attribution</w:t>
+      </w:r>
+    </w:p>
+    <w:p>
+      <w:pPr/>
+      <w:r>
+        <w:rPr>
+          <w:b w:val="0"/>
+          <w:i w:val="0"/>
+        </w:rPr>
+        <w:t>The project adds source-linked analyses, a decomposition of comparator composition, and tested reproduction paths. Original investigators performed the experiments. AI assisted analysis discussion, code, testing, figures and writing; personal contribution claims should reflect actual involvement.</w:t>
+      </w:r>
+    </w:p>
+    <w:p>
+      <w:pPr>
+        <w:pStyle w:val="Heading1"/>
+      </w:pPr>
+      <w:r>
+        <w:rPr>
+          <w:b w:val="0"/>
+          <w:i w:val="0"/>
+        </w:rPr>
+        <w:t>Inspect and reproduce</w:t>
+      </w:r>
+    </w:p>
+    <w:p>
+      <w:pPr/>
+      <w:r>
+        <w:rPr>
+          <w:b w:val="0"/>
+          <w:i w:val="0"/>
+        </w:rPr>
+        <w:t xml:space="preserve">Report: </w:t>
       </w:r>
       <w:r>
         <w:rPr>
-          <w:b/>
+          <w:rFonts w:ascii="DejaVu Sans Mono" w:hAnsi="DejaVu Sans Mono"/>
+          <w:b w:val="0"/>
+          <w:i w:val="0"/>
+          <w:sz w:val="16"/>
         </w:rPr>
-        <w:t>+1.05</w:t>
+        <w:t>reports/DDR_TargetBridge_Case_Study.pdf</w:t>
       </w:r>
       <w:r>
         <w:rPr>
           <w:b w:val="0"/>
+          <w:i w:val="0"/>
         </w:rPr>
-        <w:t xml:space="preserve">, while the comparator changes from </w:t>
+        <w:t>.</w:t>
+      </w:r>
+    </w:p>
+    <w:p>
+      <w:pPr/>
+      <w:r>
+        <w:rPr>
+          <w:b w:val="0"/>
+          <w:i w:val="0"/>
+        </w:rPr>
+        <w:t xml:space="preserve">Public core: </w:t>
       </w:r>
       <w:r>
         <w:rPr>
-          <w:b/>
+          <w:rFonts w:ascii="DejaVu Sans Mono" w:hAnsi="DejaVu Sans Mono"/>
+          <w:b w:val="0"/>
+          <w:i w:val="0"/>
+          <w:sz w:val="16"/>
         </w:rPr>
-        <w:t>+0.183 to +2.814</w:t>
+        <w:t>python tools/run.py core --output .build/core-1</w:t>
       </w:r>
       <w:r>
         <w:rPr>
           <w:b w:val="0"/>
+          <w:i w:val="0"/>
         </w:rPr>
-        <w:t>. Restoring comparator coverage also restores many low-count observations. The analysis does not establish which population represents biological truth.</w:t>
+        <w:t>.</w:t>
       </w:r>
     </w:p>
     <w:p>
+      <w:pPr/>
       <w:r>
         <w:rPr>
-          <w:b/>
+          <w:b w:val="0"/>
+          <w:i w:val="0"/>
         </w:rPr>
-        <w:t>What this project adds.</w:t>
+        <w:t>The public command begins with released transformed gene/sample records; it does not redo count qualification or normalization. Historical workbook workflows require separately retrieved source files.</w:t>
+      </w:r>
+    </w:p>
+    <w:p>
+      <w:pPr/>
+      <w:r>
+        <w:rPr>
+          <w:b w:val="0"/>
+          <w:i w:val="0"/>
+        </w:rPr>
+        <w:t>Repository: https://github.com/jiangboyan0129/DDR-TargetBridge</w:t>
+      </w:r>
+    </w:p>
+    <w:p>
+      <w:pPr/>
+      <w:r>
+        <w:rPr>
+          <w:b w:val="0"/>
+          <w:i w:val="0"/>
+        </w:rPr>
+        <w:t xml:space="preserve">Original screen: O'Loughlin et al., </w:t>
       </w:r>
       <w:r>
         <w:rPr>
           <w:b w:val="0"/>
+          <w:i/>
         </w:rPr>
-        <w:t xml:space="preserve"> A specific empirical diagnosis of comparator-population dependence, a transparent decomposition of targeting-unit versus gene membership, and runnable source-table/count-export workflows. Earlier failed transfer predictions remain separate histories, not validation of the main result.</w:t>
-      </w:r>
-    </w:p>
-    <w:p>
-      <w:r>
-        <w:rPr>
-          <w:b/>
-        </w:rPr>
-        <w:t>Decision and limit.</w:t>
+        <w:t>Nature Chemical Biology</w:t>
       </w:r>
       <w:r>
         <w:rPr>
           <w:b w:val="0"/>
+          <w:i w:val="0"/>
         </w:rPr>
-        <w:t xml:space="preserve"> Do not elevate the original positive balance to a mitochondrial-specific target claim from this archive. This is not a new mechanism, clinical biomarker or universal correction method.</w:t>
-      </w:r>
-    </w:p>
-    <w:p>
-      <w:r>
-        <w:rPr>
-          <w:b/>
-        </w:rPr>
-        <w:t>Responsibility.</w:t>
-      </w:r>
-      <w:r>
-        <w:rPr>
-          <w:b w:val="0"/>
-        </w:rPr>
-        <w:t xml:space="preserve"> Original investigators generated the experiments. The project used AI-assisted scientific discussion, coding, testing and writing. Project-level contributions and the personal-responsibility boundary are documented separately.</w:t>
-      </w:r>
-    </w:p>
-    <w:p>
-      <w:r>
-        <w:rPr>
-          <w:b/>
-        </w:rPr>
-        <w:t>Inspect.</w:t>
-      </w:r>
-      <w:r>
-        <w:rPr>
-          <w:b w:val="0"/>
-        </w:rPr>
-        <w:t xml:space="preserve"> Read </w:t>
-      </w:r>
-      <w:r>
-        <w:rPr>
-          <w:rFonts w:ascii="Noto Sans" w:hAnsi="Noto Sans"/>
-          <w:b w:val="0"/>
-          <w:sz w:val="18"/>
-        </w:rPr>
-        <w:t>reports/CASE_STUDY.pdf</w:t>
-      </w:r>
-      <w:r>
-        <w:rPr>
-          <w:b w:val="0"/>
-        </w:rPr>
-        <w:t xml:space="preserve">; start reproduction with </w:t>
-      </w:r>
-      <w:r>
-        <w:rPr>
-          <w:rFonts w:ascii="Noto Sans" w:hAnsi="Noto Sans"/>
-          <w:b w:val="0"/>
-          <w:sz w:val="18"/>
-        </w:rPr>
-        <w:t>python tools/run.py verify</w:t>
-      </w:r>
-      <w:r>
-        <w:rPr>
-          <w:b w:val="0"/>
-        </w:rPr>
-        <w:t>. The README links methods, contributions and exact sources. Primary data: O’Loughlin et al., Nature Chemical Biology (2026), doi:10.1038/s41589-026-02312-z.</w:t>
+        <w:t xml:space="preserve"> (2026), DOI: 10.1038/s41589-026-02312-z.</w:t>
       </w:r>
     </w:p>
     <w:sectPr>
       <w:headerReference w:type="default" r:id="rId9"/>
       <w:footerReference w:type="default" r:id="rId10"/>
       <w:pgSz w:w="11909" w:h="16834"/>
-      <w:pgMar w:top="950" w:right="1123" w:bottom="893" w:left="1123" w:header="346" w:footer="403" w:gutter="0"/>
+      <w:pgMar w:top="1051" w:right="1224" w:bottom="979" w:left="1224" w:header="389" w:footer="432" w:gutter="0"/>
       <w:cols w:space="720"/>
       <w:docGrid w:linePitch="360"/>
     </w:sectPr>
@@ -255,10 +277,10 @@
     </w:pPr>
     <w:r>
       <w:rPr>
-        <w:rFonts w:ascii="Noto Sans" w:hAnsi="Noto Sans"/>
+        <w:rFonts w:ascii="DejaVu Sans" w:hAnsi="DejaVu Sans"/>
         <w:sz w:val="16"/>
       </w:rPr>
-      <w:t xml:space="preserve">Portfolio 3.0  ·  Public-data secondary analysis  |  </w:t>
+      <w:t xml:space="preserve">Public edition 1.0.1  |  </w:t>
     </w:r>
     <w:fldSimple w:instr="PAGE"/>
   </w:p>
@@ -272,7 +294,7 @@
       <w:pStyle w:val="Caption"/>
     </w:pPr>
     <w:r>
-      <w:t>DDR TARGETBRIDGE  /  RESEARCH CASE STUDY</w:t>
+      <w:t>DDR TargetBridge · Public-data research case study</w:t>
     </w:r>
   </w:p>
 </w:hdr>
@@ -642,11 +664,12 @@
     <w:qFormat/>
     <w:rsid w:val="00FC693F"/>
     <w:pPr>
-      <w:spacing w:line="271" w:lineRule="auto" w:after="120"/>
+      <w:keepLines/>
+      <w:spacing w:line="259" w:lineRule="auto" w:after="100"/>
     </w:pPr>
     <w:rPr>
-      <w:rFonts w:ascii="Noto Sans" w:hAnsi="Noto Sans" w:eastAsia="Noto Sans CJK SC"/>
-      <w:sz w:val="19"/>
+      <w:rFonts w:ascii="Liberation Serif" w:hAnsi="Liberation Serif"/>
+      <w:sz w:val="21"/>
     </w:rPr>
   </w:style>
   <w:style w:type="paragraph" w:styleId="Header">
@@ -704,15 +727,15 @@
     <w:pPr>
       <w:keepNext/>
       <w:keepLines/>
-      <w:spacing w:before="180" w:after="120"/>
+      <w:spacing w:before="180" w:after="100"/>
       <w:outlineLvl w:val="0"/>
     </w:pPr>
     <w:rPr>
-      <w:rFonts w:asciiTheme="majorHAnsi" w:eastAsiaTheme="majorEastAsia" w:hAnsiTheme="majorHAnsi" w:cstheme="majorBidi" w:ascii="Noto Sans" w:hAnsi="Noto Sans"/>
+      <w:rFonts w:asciiTheme="majorHAnsi" w:eastAsiaTheme="majorEastAsia" w:hAnsiTheme="majorHAnsi" w:cstheme="majorBidi" w:ascii="DejaVu Sans" w:hAnsi="DejaVu Sans"/>
       <w:b/>
       <w:bCs/>
-      <w:color w:val="18344A"/>
-      <w:sz w:val="32"/>
+      <w:color w:val="141414"/>
+      <w:sz w:val="27"/>
       <w:szCs w:val="28"/>
     </w:rPr>
   </w:style>
@@ -728,15 +751,15 @@
     <w:pPr>
       <w:keepNext/>
       <w:keepLines/>
-      <w:spacing w:before="180" w:after="120"/>
+      <w:spacing w:before="180" w:after="100"/>
       <w:outlineLvl w:val="1"/>
     </w:pPr>
     <w:rPr>
-      <w:rFonts w:asciiTheme="majorHAnsi" w:eastAsiaTheme="majorEastAsia" w:hAnsiTheme="majorHAnsi" w:cstheme="majorBidi" w:ascii="Noto Sans" w:hAnsi="Noto Sans"/>
+      <w:rFonts w:asciiTheme="majorHAnsi" w:eastAsiaTheme="majorEastAsia" w:hAnsiTheme="majorHAnsi" w:cstheme="majorBidi" w:ascii="DejaVu Sans" w:hAnsi="DejaVu Sans"/>
       <w:b/>
       <w:bCs/>
-      <w:color w:val="18344A"/>
-      <w:sz w:val="26"/>
+      <w:color w:val="141414"/>
+      <w:sz w:val="23"/>
       <w:szCs w:val="26"/>
     </w:rPr>
   </w:style>
@@ -752,15 +775,15 @@
     <w:pPr>
       <w:keepNext/>
       <w:keepLines/>
-      <w:spacing w:before="180" w:after="120"/>
+      <w:spacing w:before="180" w:after="100"/>
       <w:outlineLvl w:val="2"/>
     </w:pPr>
     <w:rPr>
-      <w:rFonts w:asciiTheme="majorHAnsi" w:eastAsiaTheme="majorEastAsia" w:hAnsiTheme="majorHAnsi" w:cstheme="majorBidi" w:ascii="Noto Sans" w:hAnsi="Noto Sans"/>
+      <w:rFonts w:asciiTheme="majorHAnsi" w:eastAsiaTheme="majorEastAsia" w:hAnsiTheme="majorHAnsi" w:cstheme="majorBidi" w:ascii="DejaVu Sans" w:hAnsi="DejaVu Sans"/>
       <w:b/>
       <w:bCs/>
-      <w:color w:val="18344A"/>
-      <w:sz w:val="23"/>
+      <w:color w:val="141414"/>
+      <w:sz w:val="22"/>
     </w:rPr>
   </w:style>
   <w:style w:type="paragraph" w:styleId="Heading4">
@@ -992,18 +1015,15 @@
     <w:rsid w:val="00FC693F"/>
     <w:pPr>
       <w:keepNext/>
-      <w:pBdr>
-        <w:bottom w:val="single" w:sz="8" w:space="4" w:color="4F81BD" w:themeColor="accent1"/>
-      </w:pBdr>
-      <w:spacing w:after="120" w:line="240" w:lineRule="auto" w:before="180"/>
+      <w:spacing w:after="100" w:line="240" w:lineRule="auto" w:before="180"/>
       <w:contextualSpacing/>
     </w:pPr>
     <w:rPr>
-      <w:rFonts w:asciiTheme="majorHAnsi" w:eastAsiaTheme="majorEastAsia" w:hAnsiTheme="majorHAnsi" w:cstheme="majorBidi" w:ascii="Noto Sans" w:hAnsi="Noto Sans"/>
-      <w:color w:val="18344A"/>
+      <w:rFonts w:asciiTheme="majorHAnsi" w:eastAsiaTheme="majorEastAsia" w:hAnsiTheme="majorHAnsi" w:cstheme="majorBidi" w:ascii="DejaVu Sans" w:hAnsi="DejaVu Sans"/>
+      <w:color w:val="141414"/>
       <w:spacing w:val="5"/>
       <w:kern w:val="28"/>
-      <w:sz w:val="50"/>
+      <w:sz w:val="48"/>
       <w:szCs w:val="52"/>
     </w:rPr>
   </w:style>
@@ -1080,11 +1100,12 @@
     <w:unhideWhenUsed/>
     <w:rsid w:val="00AA1D8D"/>
     <w:pPr>
-      <w:spacing w:after="120" w:line="271" w:lineRule="auto"/>
+      <w:keepLines/>
+      <w:spacing w:after="100" w:line="259" w:lineRule="auto"/>
     </w:pPr>
     <w:rPr>
-      <w:rFonts w:ascii="Noto Sans" w:hAnsi="Noto Sans" w:eastAsia="Noto Sans CJK SC"/>
-      <w:sz w:val="19"/>
+      <w:rFonts w:ascii="Liberation Serif" w:hAnsi="Liberation Serif"/>
+      <w:sz w:val="21"/>
     </w:rPr>
   </w:style>
   <w:style w:type="character" w:customStyle="1" w:styleId="BodyTextChar">
@@ -1442,14 +1463,15 @@
     <w:qFormat/>
     <w:rsid w:val="00FC693F"/>
     <w:pPr>
-      <w:spacing w:line="252" w:lineRule="auto" w:after="140"/>
+      <w:keepLines/>
+      <w:spacing w:line="250" w:lineRule="auto" w:after="160"/>
     </w:pPr>
     <w:rPr>
-      <w:rFonts w:ascii="Noto Sans" w:hAnsi="Noto Sans"/>
+      <w:rFonts w:ascii="DejaVu Sans" w:hAnsi="DejaVu Sans"/>
       <w:b/>
       <w:bCs/>
-      <w:color w:val="536571"/>
-      <w:sz w:val="17"/>
+      <w:color w:val="2D2D2D"/>
+      <w:sz w:val="16"/>
       <w:szCs w:val="18"/>
     </w:rPr>
   </w:style>
@@ -1484,9 +1506,6 @@
     <w:qFormat/>
     <w:rsid w:val="00FC693F"/>
     <w:pPr>
-      <w:pBdr>
-        <w:bottom w:val="single" w:sz="4" w:space="4" w:color="4F81BD" w:themeColor="accent1"/>
-      </w:pBdr>
       <w:spacing w:before="200" w:after="280"/>
       <w:ind w:left="936" w:right="936"/>
     </w:pPr>

</xml_diff>